<commit_message>
Fill ASU resume salary history and Aimollae Book start date
Co-Authored-By: Claude Sonnet 5.5 <noreply@anthropic.com>
Claude-Session: https://claude.ai/code/session_01TxiZBwuSbNT5xu8DH8oTXg
</commit_message>
<xml_diff>
--- a/ASU_MSBA/resume/Sukwoo_Chung_Resume_ASU_MSBA.docx
+++ b/ASU_MSBA/resume/Sukwoo_Chung_Resume_ASU_MSBA.docx
@@ -469,7 +469,7 @@
         <w:ind w:left="317"/>
       </w:pPr>
       <w:r>
-        <w:t>Founder/Product Owner, Aimollae Book ([MM/YY] – Present): designed and commercialized a phone-hiding book for parents, selling 2,000+ units and generating approximately $25K in revenue; preparing U.S. market launch</w:t>
+        <w:t>Founder/Product Owner, Aimollae Book (11/25 – Present): designed and commercialized a phone-hiding book for parents, selling 2,000+ units and generating approximately $25K in revenue; preparing U.S. market launch</w:t>
       </w:r>
     </w:p>
     <w:p>
@@ -574,7 +574,7 @@
         <w:t xml:space="preserve">Samsung SDS (09/24 – Present): </w:t>
       </w:r>
       <w:r>
-        <w:t>[연봉 입력: KRW ______ / 약 USD ______]</w:t>
+        <w:t>Current annual base salary KRW 120 million (approx. USD 88,000)</w:t>
       </w:r>
     </w:p>
     <w:p>
@@ -585,7 +585,7 @@
         <w:t xml:space="preserve">Korean Air (01/14 – 08/24): </w:t>
       </w:r>
       <w:r>
-        <w:t>[재직 종료 시점 연봉 입력, 또는 연도별 범위]</w:t>
+        <w:t>Final annual base salary KRW 90 million (approx. USD 66,000)</w:t>
       </w:r>
     </w:p>
     <w:sectPr>

</xml_diff>